<commit_message>
Fix A-1/A-2 docx splitting logic and update files
</commit_message>
<xml_diff>
--- a/build/static/downloads/contract_A1.docx
+++ b/build/static/downloads/contract_A1.docx
@@ -683,19 +683,6 @@
     </w:tbl>
     <w:p/>
     <w:p>
-      <w:pPr>
-        <w:spacing w:after="40" w:line="320" w:lineRule="exact"/>
-      </w:pPr>
-      <w:r>
-        <w:rPr>
-          <w:rFonts w:ascii="나눔고딕" w:hAnsi="나눔고딕" w:eastAsia="나눔고딕"/>
-          <w:b w:val="0"/>
-          <w:sz w:val="20"/>
-        </w:rPr>
-        <w:t>💡</w:t>
-      </w:r>
-    </w:p>
-    <w:p>
       <w:r>
         <w:br w:type="page"/>
       </w:r>

</xml_diff>